<commit_message>
se agregan archivos faltantes y se elimina archivo 1.1.2 de carpeta equivocada
</commit_message>
<xml_diff>
--- a/Gestión/1.1.2 Documento de registro de definición e identificación del proyecto.docx
+++ b/Gestión/1.1.2 Documento de registro de definición e identificación del proyecto.docx
@@ -870,16 +870,16 @@
                   <wp:extent cx="502920" cy="502920"/>
                   <wp:effectExtent b="0" l="0" r="0" t="0"/>
                   <wp:wrapNone/>
-                  <wp:docPr descr="Código QR con relleno sólido" id="2106009978" name="image4.png"/>
+                  <wp:docPr descr="Código QR con relleno sólido" id="2106009978" name="image1.png"/>
                   <a:graphic>
                     <a:graphicData uri="http://schemas.openxmlformats.org/drawingml/2006/picture">
                       <pic:pic>
                         <pic:nvPicPr>
-                          <pic:cNvPr descr="Código QR con relleno sólido" id="0" name="image4.png"/>
+                          <pic:cNvPr descr="Código QR con relleno sólido" id="0" name="image1.png"/>
                           <pic:cNvPicPr preferRelativeResize="0"/>
                         </pic:nvPicPr>
                         <pic:blipFill>
-                          <a:blip r:embed="rId7"/>
+                          <a:blip r:embed="rId9"/>
                           <a:srcRect b="0" l="0" r="0" t="0"/>
                           <a:stretch>
                             <a:fillRect/>
@@ -1015,7 +1015,7 @@
                         <pic:cNvPicPr preferRelativeResize="0"/>
                       </pic:nvPicPr>
                       <pic:blipFill>
-                        <a:blip r:embed="rId8"/>
+                        <a:blip r:embed="rId10"/>
                         <a:srcRect/>
                         <a:stretch>
                           <a:fillRect/>
@@ -1155,16 +1155,16 @@
                 <wp:inline distB="0" distT="0" distL="0" distR="0">
                   <wp:extent cx="503555" cy="503555"/>
                   <wp:effectExtent b="0" l="0" r="0" t="0"/>
-                  <wp:docPr descr="Lista con relleno sólido" id="2106009981" name="image1.png"/>
+                  <wp:docPr descr="Lista con relleno sólido" id="2106009981" name="image2.png"/>
                   <a:graphic>
                     <a:graphicData uri="http://schemas.openxmlformats.org/drawingml/2006/picture">
                       <pic:pic>
                         <pic:nvPicPr>
-                          <pic:cNvPr descr="Lista con relleno sólido" id="0" name="image1.png"/>
+                          <pic:cNvPr descr="Lista con relleno sólido" id="0" name="image2.png"/>
                           <pic:cNvPicPr preferRelativeResize="0"/>
                         </pic:nvPicPr>
                         <pic:blipFill>
-                          <a:blip r:embed="rId9"/>
+                          <a:blip r:embed="rId11"/>
                           <a:srcRect b="0" l="0" r="0" t="0"/>
                           <a:stretch>
                             <a:fillRect/>
@@ -1288,7 +1288,7 @@
                         <pic:cNvPicPr preferRelativeResize="0"/>
                       </pic:nvPicPr>
                       <pic:blipFill>
-                        <a:blip r:embed="rId8"/>
+                        <a:blip r:embed="rId10"/>
                         <a:srcRect/>
                         <a:stretch>
                           <a:fillRect/>
@@ -1417,16 +1417,16 @@
                 <wp:inline distB="0" distT="0" distL="0" distR="0">
                   <wp:extent cx="432019" cy="432019"/>
                   <wp:effectExtent b="0" l="0" r="0" t="0"/>
-                  <wp:docPr descr="Inteligencia artificial con relleno sólido" id="2106009980" name="image2.png"/>
+                  <wp:docPr descr="Inteligencia artificial con relleno sólido" id="2106009980" name="image3.png"/>
                   <a:graphic>
                     <a:graphicData uri="http://schemas.openxmlformats.org/drawingml/2006/picture">
                       <pic:pic>
                         <pic:nvPicPr>
-                          <pic:cNvPr descr="Inteligencia artificial con relleno sólido" id="0" name="image2.png"/>
+                          <pic:cNvPr descr="Inteligencia artificial con relleno sólido" id="0" name="image3.png"/>
                           <pic:cNvPicPr preferRelativeResize="0"/>
                         </pic:nvPicPr>
                         <pic:blipFill>
-                          <a:blip r:embed="rId10"/>
+                          <a:blip r:embed="rId12"/>
                           <a:srcRect b="0" l="0" r="0" t="0"/>
                           <a:stretch>
                             <a:fillRect/>
@@ -1598,7 +1598,7 @@
                         <pic:cNvPicPr preferRelativeResize="0"/>
                       </pic:nvPicPr>
                       <pic:blipFill>
-                        <a:blip r:embed="rId8"/>
+                        <a:blip r:embed="rId10"/>
                         <a:srcRect/>
                         <a:stretch>
                           <a:fillRect/>
@@ -2995,22 +2995,8 @@
             </w:pPr>
             <w:r>
               <w:rPr>
-                <w:rFonts w:ascii="Calibri" w:cs="Calibri" w:eastAsia="Calibri" w:hAnsi="Calibri"/>
-                <w:b w:val="0"/>
-                <w:bCs w:val="0"/>
-                <w:i w:val="0"/>
-                <w:iCs w:val="0"/>
-                <w:smallCaps w:val="0"/>
-                <w:strike w:val="0"/>
-                <w:color w:val="1f4e79"/>
-                <w:sz w:val="22"/>
-                <w:szCs w:val="22"/>
-                <w:u w:val="none"/>
-                <w:shd w:fill="auto" w:val="clear"/>
-                <w:vertAlign w:val="baseline"/>
-                <w:rtl w:val="0"/>
-              </w:rPr>
-              <w:t xml:space="preserve">En la descripción debes señalar brevemente el nombre, descripción, objetivos y alcance del proyecto</w:t>
+                <w:rtl w:val="0"/>
+              </w:rPr>
             </w:r>
           </w:p>
         </w:tc>
@@ -3216,7 +3202,7 @@
                 <w:szCs w:val="20"/>
                 <w:rtl w:val="0"/>
               </w:rPr>
-              <w:t xml:space="preserve">Aplicación móvil que lleve pauta de proteínas, calorías, carbohidratos, etc de usuario, rutina de ejercicios y ayuda en preparación de comidas</w:t>
+              <w:t xml:space="preserve">Aplicación móvil que lleva pauta de proteínas, calorías, carbohidratos, etc consumidas durante el día del usuario, rutina de ejercicios y recomendación de comidas a consumir en base a los nutrientes faltantes.</w:t>
             </w:r>
           </w:p>
         </w:tc>
@@ -3634,7 +3620,7 @@
                 <w:szCs w:val="20"/>
                 <w:rtl w:val="0"/>
               </w:rPr>
-              <w:t xml:space="preserve">La aplicación permitirá la creación y cálculo de macros, así como la recomendación de productos alimenticios para llegar a las metas diarias asignadas por el administrador para cada usuario, Al igual que existirá una sección que permita crear una rutina de ejercicios personalizada para cada usuario.</w:t>
+              <w:t xml:space="preserve">La aplicación permitirá la creación y cálculo de macros, así como la recomendación de productos alimenticios para llegar a las metas diarias asignadas por el administrador para cada usuario guiándose por la fórmula denominada “Tasa Metabólica Basal ”, Al igual que una sección que permita crear una rutina de ejercicios personalizada para cada usuario.</w:t>
             </w:r>
             <w:r>
               <w:rPr>
@@ -3793,22 +3779,8 @@
             </w:pPr>
             <w:r>
               <w:rPr>
-                <w:rFonts w:ascii="Calibri" w:cs="Calibri" w:eastAsia="Calibri" w:hAnsi="Calibri"/>
-                <w:b w:val="0"/>
-                <w:bCs w:val="0"/>
-                <w:i w:val="0"/>
-                <w:iCs w:val="0"/>
-                <w:smallCaps w:val="0"/>
-                <w:strike w:val="0"/>
-                <w:color w:val="1f4e79"/>
-                <w:sz w:val="22"/>
-                <w:szCs w:val="22"/>
-                <w:u w:val="none"/>
-                <w:shd w:fill="auto" w:val="clear"/>
-                <w:vertAlign w:val="baseline"/>
-                <w:rtl w:val="0"/>
-              </w:rPr>
-              <w:t xml:space="preserve">Especificar los antecedentes y motivación para el desarrollo del proyecto, publico objetivo, estado del arte, origen de la problemática y descripción del problema resolver.</w:t>
+                <w:rtl w:val="0"/>
+              </w:rPr>
             </w:r>
           </w:p>
         </w:tc>
@@ -3834,49 +3806,6 @@
             </w:tcMar>
             <w:vAlign w:val="center"/>
           </w:tcPr>
-          <w:p>
-            <w:pPr>
-              <w:spacing w:line="259" w:lineRule="auto"/>
-              <w:rPr>
-                <w:rFonts w:ascii="Calibri" w:cs="Calibri" w:eastAsia="Calibri" w:hAnsi="Calibri"/>
-                <w:i w:val="1"/>
-                <w:iCs w:val="1"/>
-                <w:color w:val="548dd4"/>
-                <w:sz w:val="20"/>
-                <w:szCs w:val="20"/>
-              </w:rPr>
-            </w:pPr>
-            <w:r>
-              <w:rPr>
-                <w:rFonts w:ascii="Calibri" w:cs="Calibri" w:eastAsia="Calibri" w:hAnsi="Calibri"/>
-                <w:i w:val="1"/>
-                <w:iCs w:val="1"/>
-                <w:color w:val="548dd4"/>
-                <w:sz w:val="20"/>
-                <w:szCs w:val="20"/>
-                <w:rtl w:val="0"/>
-              </w:rPr>
-              <w:t xml:space="preserve">Especificar los antecedentes y motivación que llevaron a la creación del proyecto y la oportunidad o problemática  a resolver</w:t>
-            </w:r>
-          </w:p>
-          <w:p>
-            <w:pPr>
-              <w:spacing w:line="259" w:lineRule="auto"/>
-              <w:rPr>
-                <w:rFonts w:ascii="Calibri" w:cs="Calibri" w:eastAsia="Calibri" w:hAnsi="Calibri"/>
-                <w:i w:val="1"/>
-                <w:iCs w:val="1"/>
-                <w:color w:val="548dd4"/>
-                <w:sz w:val="20"/>
-                <w:szCs w:val="20"/>
-              </w:rPr>
-            </w:pPr>
-            <w:r>
-              <w:rPr>
-                <w:rtl w:val="0"/>
-              </w:rPr>
-            </w:r>
-          </w:p>
           <w:p>
             <w:pPr>
               <w:keepNext w:val="0"/>
@@ -3917,7 +3846,7 @@
                 <w:szCs w:val="20"/>
                 <w:rtl w:val="0"/>
               </w:rPr>
-              <w:t xml:space="preserve">El problema se originó al usar otras app nutricionales y ver que la aplicación solo toma en cuenta los valores calóricos para llevar un conteo diario </w:t>
+              <w:t xml:space="preserve">El problema se originó al usar otras app nutricionales y ver que la aplicación solo toma en cuenta los valores calóricos para llevar un conteo diario. </w:t>
             </w:r>
           </w:p>
           <w:p>
@@ -3996,7 +3925,7 @@
                 <w:szCs w:val="20"/>
                 <w:rtl w:val="0"/>
               </w:rPr>
-              <w:t xml:space="preserve">Aplicación móvil de administración de consumo de alimentos teniendo en cuenta el valor nutricional de la comida y ayuda con rutinas de ejercicio definidas por nivel de intensidad.</w:t>
+              <w:t xml:space="preserve">Esta aplicación móvil de administración de consumo de alimentos se desarrolla teniendo en cuenta el valor nutricional de la comida y ayuda con rutinas de ejercicio definidas por nivel de intensidad.</w:t>
             </w:r>
           </w:p>
           <w:p>
@@ -4039,7 +3968,7 @@
                 <w:szCs w:val="20"/>
                 <w:rtl w:val="0"/>
               </w:rPr>
-              <w:t xml:space="preserve">Lo que se busca con esta app es mejorar la función de contar calorías (que ya poseen otras app) teniendo en cuenta el valor de sus macronutrientes  aconsejando al usuario que alimentos consumir dependiendo de los nutrientes que le faltan por consumir en el día. También se busca juntar en la misma app la función de rutinas de ejercicio para que el usuario pueda tener todo en un solo lugar</w:t>
+              <w:t xml:space="preserve">Lo que se busca con esta app es mejorar la función de contar calorías (que ya poseen otras app) teniendo en cuenta el valor de sus macronutrientes  aconsejando al usuario que alimentos consumir dependiendo de los nutrientes que le faltan por consumir en el día, Así como también se busca juntar en la misma app la función de rutinas de ejercicio para que el usuario pueda tener todo en un solo lugar.</w:t>
             </w:r>
           </w:p>
           <w:p>
@@ -4381,7 +4310,7 @@
                 <w:szCs w:val="20"/>
                 <w:rtl w:val="0"/>
               </w:rPr>
-              <w:t xml:space="preserve">El equipo comenzará el desarrollo del proyecto con la documentación de requisitos sugeridos por el cliente, una vez recopilada esta información se comenzará con la planificación del funcionamiento a través de un diagrama de despliegue y el maquetado de la aplicación con sugerencias visuales para el cliente, Una vez aprobadas las primeras etapas se comienza el desarrollo del software comenzando por la base de datos, luego el modelo de la aplicación, sus respectivos test y configuraciones de seguridad finalizando con su despliegue en la nube AWS.</w:t>
+              <w:t xml:space="preserve">El equipo comenzará el desarrollo del proyecto con la documentación de requisitos sugeridos por el cliente (calculo de TMB, niveles de intensidad de actividad física y objetivos), una vez recopilada esta información se comenzará con la planificación del funcionamiento a través de un diagrama de despliegue y el maquetado de la aplicación con sugerencias visuales para el cliente, Una vez aprobadas las primeras etapas se comienza el desarrollo del software comenzando por la base de datos, luego el modelo de la aplicación, sus respectivos test y configuraciones de seguridad finalizando con su despliegue en la nube Oracle.</w:t>
             </w:r>
           </w:p>
           <w:p>
@@ -4829,7 +4758,7 @@
                 <w:szCs w:val="20"/>
                 <w:rtl w:val="0"/>
               </w:rPr>
-              <w:t xml:space="preserve">AWS - MySQL - Docker -  GitHub - Dispositivos Android </w:t>
+              <w:t xml:space="preserve">Oracle - MySQL - Docker -  GitHub - Dispositivos Android </w:t>
             </w:r>
           </w:p>
           <w:p>
@@ -4855,7 +4784,7 @@
                 <w:szCs w:val="20"/>
                 <w:rtl w:val="0"/>
               </w:rPr>
-              <w:t xml:space="preserve">AWS: Proveedor IaaS, que entrega herramientas para el desarrollo de máquinas virtuales, instancias, que sostienen la aplicación con redundancia y alta disponibilidad en la web.</w:t>
+              <w:t xml:space="preserve">Oracle cloud: Proveedor IaaS, que entrega herramientas para el desarrollo de máquinas virtuales, instancias, que sostienen la aplicación con redundancia y alta disponibilidad en la web.</w:t>
             </w:r>
           </w:p>
           <w:p>
@@ -4907,7 +4836,7 @@
                 <w:szCs w:val="20"/>
                 <w:rtl w:val="0"/>
               </w:rPr>
-              <w:t xml:space="preserve">MySQL:</w:t>
+              <w:t xml:space="preserve">MySQL: Base de datos con la cual trabajará la aplicación </w:t>
             </w:r>
           </w:p>
           <w:p>
@@ -4933,7 +4862,7 @@
                 <w:szCs w:val="20"/>
                 <w:rtl w:val="0"/>
               </w:rPr>
-              <w:t xml:space="preserve">Docker:</w:t>
+              <w:t xml:space="preserve">Docker:  Herramienta  de  despliegue del backend</w:t>
             </w:r>
           </w:p>
           <w:p>
@@ -4959,7 +4888,7 @@
                 <w:szCs w:val="20"/>
                 <w:rtl w:val="0"/>
               </w:rPr>
-              <w:t xml:space="preserve">Dispositivos Android:</w:t>
+              <w:t xml:space="preserve">Dispositivos Android: Esta será una aplicación nativa de android, por lo cual solo funcionara en este tipo  de  OS</w:t>
             </w:r>
           </w:p>
           <w:p>
@@ -5109,7 +5038,7 @@
                 <w:szCs w:val="20"/>
                 <w:rtl w:val="0"/>
               </w:rPr>
-              <w:t xml:space="preserve">MVVM: </w:t>
+              <w:t xml:space="preserve">MVVM: Arquitectura en  la cual será desarrollada la aplicación.</w:t>
             </w:r>
           </w:p>
           <w:p>
@@ -5131,7 +5060,7 @@
                 <w:szCs w:val="20"/>
                 <w:rtl w:val="0"/>
               </w:rPr>
-              <w:t xml:space="preserve">Microservicios: La aplicación contará con 3 microservicios principales los cuales serán, Conteo e informe diario y semanal de macros, recomendación de productos alimenticios a medida de que va cambiando el conteo de macros y por último un gestor de rutinas de ejercicio. </w:t>
+              <w:t xml:space="preserve">Microservicios: La aplicación contará con 4 microservicios principales los cuales serán, Conteo e informe diario y semanal de macros, recomendación de productos alimenticios a medida de que va cambiando el conteo de macros y por último un gestor de rutinas de ejercicio. </w:t>
             </w:r>
           </w:p>
           <w:p>
@@ -5484,7 +5413,7 @@
               </w:rPr>
               <w:t xml:space="preserve">Para revisar APIs:</w:t>
             </w:r>
-            <w:hyperlink r:id="rId11">
+            <w:hyperlink r:id="rId13">
               <w:r>
                 <w:rPr>
                   <w:rFonts w:ascii="Calibri" w:cs="Calibri" w:eastAsia="Calibri" w:hAnsi="Calibri"/>
@@ -5511,7 +5440,7 @@
               </w:rPr>
               <w:t xml:space="preserve"> o </w:t>
             </w:r>
-            <w:hyperlink r:id="rId12">
+            <w:hyperlink r:id="rId14">
               <w:r>
                 <w:rPr>
                   <w:rFonts w:ascii="Calibri" w:cs="Calibri" w:eastAsia="Calibri" w:hAnsi="Calibri"/>
@@ -5571,6 +5500,8 @@
                 <w:rtl w:val="0"/>
               </w:rPr>
               <w:t xml:space="preserve">Repositorio:</w:t>
+              <w:br w:type="textWrapping"/>
+              <w:t xml:space="preserve">Trabajo:</w:t>
             </w:r>
             <w:r>
               <w:rPr>
@@ -5591,6 +5522,21 @@
                 <w:szCs w:val="20"/>
               </w:rPr>
             </w:pPr>
+            <w:hyperlink r:id="rId15">
+              <w:r>
+                <w:rPr>
+                  <w:rFonts w:ascii="Calibri" w:cs="Calibri" w:eastAsia="Calibri" w:hAnsi="Calibri"/>
+                  <w:i w:val="1"/>
+                  <w:iCs w:val="1"/>
+                  <w:color w:val="1155cc"/>
+                  <w:sz w:val="20"/>
+                  <w:szCs w:val="20"/>
+                  <w:u w:val="single"/>
+                  <w:rtl w:val="0"/>
+                </w:rPr>
+                <w:t xml:space="preserve">https://github.com/Cri-orellana/Macrofit_Grupo06_TPY1101_001D</w:t>
+              </w:r>
+            </w:hyperlink>
             <w:r>
               <w:rPr>
                 <w:rFonts w:ascii="Calibri" w:cs="Calibri" w:eastAsia="Calibri" w:hAnsi="Calibri"/>
@@ -5601,7 +5547,37 @@
                 <w:szCs w:val="20"/>
                 <w:rtl w:val="0"/>
               </w:rPr>
-              <w:t xml:space="preserve">https://github.com/Cri-orellana/Proyecto-Nutricion</w:t>
+              <w:br w:type="textWrapping"/>
+              <w:br w:type="textWrapping"/>
+              <w:t xml:space="preserve">Presentación:</w:t>
+              <w:br w:type="textWrapping"/>
+            </w:r>
+            <w:hyperlink r:id="rId16">
+              <w:r>
+                <w:rPr>
+                  <w:rFonts w:ascii="Calibri" w:cs="Calibri" w:eastAsia="Calibri" w:hAnsi="Calibri"/>
+                  <w:i w:val="1"/>
+                  <w:iCs w:val="1"/>
+                  <w:color w:val="1155cc"/>
+                  <w:sz w:val="20"/>
+                  <w:szCs w:val="20"/>
+                  <w:u w:val="single"/>
+                  <w:rtl w:val="0"/>
+                </w:rPr>
+                <w:t xml:space="preserve">https://github.com/Cri-orellana/Grupo06_TPY1101_001D</w:t>
+              </w:r>
+            </w:hyperlink>
+            <w:r>
+              <w:rPr>
+                <w:rFonts w:ascii="Calibri" w:cs="Calibri" w:eastAsia="Calibri" w:hAnsi="Calibri"/>
+                <w:i w:val="1"/>
+                <w:iCs w:val="1"/>
+                <w:color w:val="548dd4"/>
+                <w:sz w:val="20"/>
+                <w:szCs w:val="20"/>
+                <w:rtl w:val="0"/>
+              </w:rPr>
+              <w:br w:type="textWrapping"/>
             </w:r>
           </w:p>
           <w:p>
@@ -7138,7 +7114,7 @@
                 <w:szCs w:val="18"/>
                 <w:rtl w:val="0"/>
               </w:rPr>
-              <w:t xml:space="preserve">Levantamiento de instancias en AWS</w:t>
+              <w:t xml:space="preserve">Levantamiento de instancias en Oracle</w:t>
             </w:r>
           </w:p>
         </w:tc>
@@ -7174,7 +7150,7 @@
                 <w:szCs w:val="18"/>
                 <w:rtl w:val="0"/>
               </w:rPr>
-              <w:t xml:space="preserve">se crean las instancias y se configura los productos que se utilizaran en AWS (EC2, Elastic web service)</w:t>
+              <w:t xml:space="preserve">se crean las instancias y se configura los productos que se utilizaran en Oracle Cloud</w:t>
             </w:r>
           </w:p>
         </w:tc>
@@ -7210,7 +7186,7 @@
                 <w:szCs w:val="18"/>
                 <w:rtl w:val="0"/>
               </w:rPr>
-              <w:t xml:space="preserve">AWS</w:t>
+              <w:t xml:space="preserve">Oracle</w:t>
             </w:r>
           </w:p>
         </w:tc>
@@ -7246,7 +7222,7 @@
                 <w:szCs w:val="18"/>
                 <w:rtl w:val="0"/>
               </w:rPr>
-              <w:t xml:space="preserve">1 Día</w:t>
+              <w:t xml:space="preserve">1 Semana</w:t>
             </w:r>
           </w:p>
         </w:tc>
@@ -7616,6 +7592,15 @@
                 <w:szCs w:val="18"/>
               </w:rPr>
             </w:pPr>
+            <w:sdt>
+              <w:sdtPr>
+                <w:id w:val="-802359526"/>
+                <w:tag w:val="goog_rdk_0"/>
+              </w:sdtPr>
+              <w:sdtContent>
+                <w:commentRangeStart w:id="0"/>
+              </w:sdtContent>
+            </w:sdt>
             <w:r>
               <w:rPr>
                 <w:rFonts w:ascii="Calibri" w:cs="Calibri" w:eastAsia="Calibri" w:hAnsi="Calibri"/>
@@ -7626,6 +7611,15 @@
               </w:rPr>
               <w:t xml:space="preserve">4.-</w:t>
             </w:r>
+            <w:commentRangeEnd w:id="0"/>
+            <w:r>
+              <w:commentReference w:id="0"/>
+            </w:r>
+            <w:r>
+              <w:rPr>
+                <w:rtl w:val="0"/>
+              </w:rPr>
+            </w:r>
           </w:p>
         </w:tc>
         <w:tc>
@@ -7696,7 +7690,7 @@
                 <w:szCs w:val="18"/>
                 <w:rtl w:val="0"/>
               </w:rPr>
-              <w:t xml:space="preserve">Programación con lenguaje Kotlin de la aplicación y sus 3 microservicios (Macros, recomendaciones y rutinas)</w:t>
+              <w:t xml:space="preserve">Programación con lenguaje Kotlin de la aplicación y sus 4 microservicios (Usuarios,Macros, recomendaciones y rutinas)</w:t>
             </w:r>
           </w:p>
         </w:tc>
@@ -7735,6 +7729,28 @@
               <w:t xml:space="preserve">Android Studio, APIs</w:t>
             </w:r>
           </w:p>
+          <w:p>
+            <w:pPr>
+              <w:spacing w:line="259" w:lineRule="auto"/>
+              <w:jc w:val="both"/>
+              <w:rPr>
+                <w:rFonts w:ascii="Calibri" w:cs="Calibri" w:eastAsia="Calibri" w:hAnsi="Calibri"/>
+                <w:color w:val="548dd4"/>
+                <w:sz w:val="18"/>
+                <w:szCs w:val="18"/>
+              </w:rPr>
+            </w:pPr>
+            <w:r>
+              <w:rPr>
+                <w:rFonts w:ascii="Calibri" w:cs="Calibri" w:eastAsia="Calibri" w:hAnsi="Calibri"/>
+                <w:color w:val="548dd4"/>
+                <w:sz w:val="18"/>
+                <w:szCs w:val="18"/>
+                <w:rtl w:val="0"/>
+              </w:rPr>
+              <w:t xml:space="preserve">(Spoonacular, MyMemory )</w:t>
+            </w:r>
+          </w:p>
         </w:tc>
         <w:tc>
           <w:tcPr>
@@ -7768,7 +7784,7 @@
                 <w:szCs w:val="18"/>
                 <w:rtl w:val="0"/>
               </w:rPr>
-              <w:t xml:space="preserve">3 semanas</w:t>
+              <w:t xml:space="preserve">7 semanas</w:t>
             </w:r>
           </w:p>
         </w:tc>
@@ -8116,7 +8132,7 @@
                 <w:szCs w:val="18"/>
                 <w:rtl w:val="0"/>
               </w:rPr>
-              <w:t xml:space="preserve">1</w:t>
+              <w:t xml:space="preserve">2 semanas</w:t>
             </w:r>
           </w:p>
         </w:tc>
@@ -8377,7 +8393,7 @@
                 <w:szCs w:val="18"/>
                 <w:rtl w:val="0"/>
               </w:rPr>
-              <w:t xml:space="preserve">2 semanas</w:t>
+              <w:t xml:space="preserve">4 semanas</w:t>
             </w:r>
           </w:p>
         </w:tc>
@@ -9007,7 +9023,7 @@
     <w:tbl>
       <w:tblPr>
         <w:tblStyle w:val="Table17"/>
-        <w:tblW w:w="8835.0" w:type="dxa"/>
+        <w:tblW w:w="8850.0" w:type="dxa"/>
         <w:jc w:val="left"/>
         <w:tblBorders>
           <w:top w:color="000000" w:space="0" w:sz="6" w:val="single"/>
@@ -9021,16 +9037,16 @@
         <w:tblLook w:val="0400"/>
       </w:tblPr>
       <w:tblGrid>
-        <w:gridCol w:w="541"/>
-        <w:gridCol w:w="3679"/>
-        <w:gridCol w:w="2413"/>
-        <w:gridCol w:w="2202"/>
+        <w:gridCol w:w="540"/>
+        <w:gridCol w:w="3675"/>
+        <w:gridCol w:w="2415"/>
+        <w:gridCol w:w="2220"/>
         <w:tblGridChange w:id="0">
           <w:tblGrid>
-            <w:gridCol w:w="541"/>
-            <w:gridCol w:w="3679"/>
-            <w:gridCol w:w="2413"/>
-            <w:gridCol w:w="2202"/>
+            <w:gridCol w:w="540"/>
+            <w:gridCol w:w="3675"/>
+            <w:gridCol w:w="2415"/>
+            <w:gridCol w:w="2220"/>
           </w:tblGrid>
         </w:tblGridChange>
       </w:tblGrid>
@@ -9844,7 +9860,7 @@
                 <w:szCs w:val="22"/>
               </w:rPr>
             </w:pPr>
-            <w:hyperlink r:id="rId13">
+            <w:hyperlink r:id="rId17">
               <w:r>
                 <w:rPr>
                   <w:rFonts w:ascii="Calibri" w:cs="Calibri" w:eastAsia="Calibri" w:hAnsi="Calibri"/>
@@ -10080,7 +10096,7 @@
                 <w:szCs w:val="22"/>
               </w:rPr>
             </w:pPr>
-            <w:hyperlink r:id="rId14">
+            <w:hyperlink r:id="rId18">
               <w:r>
                 <w:rPr>
                   <w:rFonts w:ascii="Calibri" w:cs="Calibri" w:eastAsia="Calibri" w:hAnsi="Calibri"/>
@@ -10296,7 +10312,7 @@
                 <w:szCs w:val="22"/>
               </w:rPr>
             </w:pPr>
-            <w:hyperlink r:id="rId15">
+            <w:hyperlink r:id="rId19">
               <w:r>
                 <w:rPr>
                   <w:rFonts w:ascii="Calibri" w:cs="Calibri" w:eastAsia="Calibri" w:hAnsi="Calibri"/>
@@ -10512,6 +10528,19 @@
                 <w:szCs w:val="22"/>
               </w:rPr>
             </w:pPr>
+            <w:hyperlink r:id="rId20">
+              <w:r>
+                <w:rPr>
+                  <w:rFonts w:ascii="Calibri" w:cs="Calibri" w:eastAsia="Calibri" w:hAnsi="Calibri"/>
+                  <w:color w:val="1155cc"/>
+                  <w:sz w:val="22"/>
+                  <w:szCs w:val="22"/>
+                  <w:u w:val="single"/>
+                  <w:rtl w:val="0"/>
+                </w:rPr>
+                <w:t xml:space="preserve">Componentes</w:t>
+              </w:r>
+            </w:hyperlink>
             <w:r>
               <w:rPr>
                 <w:rtl w:val="0"/>
@@ -10715,6 +10744,19 @@
                 <w:szCs w:val="22"/>
               </w:rPr>
             </w:pPr>
+            <w:hyperlink r:id="rId21">
+              <w:r>
+                <w:rPr>
+                  <w:rFonts w:ascii="Calibri" w:cs="Calibri" w:eastAsia="Calibri" w:hAnsi="Calibri"/>
+                  <w:color w:val="1155cc"/>
+                  <w:sz w:val="22"/>
+                  <w:szCs w:val="22"/>
+                  <w:u w:val="single"/>
+                  <w:rtl w:val="0"/>
+                </w:rPr>
+                <w:t xml:space="preserve">Despliegue</w:t>
+              </w:r>
+            </w:hyperlink>
             <w:r>
               <w:rPr>
                 <w:rtl w:val="0"/>
@@ -10911,6 +10953,19 @@
                 <w:szCs w:val="22"/>
               </w:rPr>
             </w:pPr>
+            <w:hyperlink r:id="rId22">
+              <w:r>
+                <w:rPr>
+                  <w:rFonts w:ascii="Calibri" w:cs="Calibri" w:eastAsia="Calibri" w:hAnsi="Calibri"/>
+                  <w:color w:val="1155cc"/>
+                  <w:sz w:val="22"/>
+                  <w:szCs w:val="22"/>
+                  <w:u w:val="single"/>
+                  <w:rtl w:val="0"/>
+                </w:rPr>
+                <w:t xml:space="preserve">Secuencia</w:t>
+              </w:r>
+            </w:hyperlink>
             <w:r>
               <w:rPr>
                 <w:rtl w:val="0"/>
@@ -11095,7 +11150,7 @@
                 <w:szCs w:val="22"/>
               </w:rPr>
             </w:pPr>
-            <w:hyperlink r:id="rId16">
+            <w:hyperlink r:id="rId23">
               <w:r>
                 <w:rPr>
                   <w:rFonts w:ascii="Calibri" w:cs="Calibri" w:eastAsia="Calibri" w:hAnsi="Calibri"/>
@@ -11292,6 +11347,19 @@
                 <w:szCs w:val="22"/>
               </w:rPr>
             </w:pPr>
+            <w:hyperlink r:id="rId24">
+              <w:r>
+                <w:rPr>
+                  <w:rFonts w:ascii="Calibri" w:cs="Calibri" w:eastAsia="Calibri" w:hAnsi="Calibri"/>
+                  <w:color w:val="1155cc"/>
+                  <w:sz w:val="22"/>
+                  <w:szCs w:val="22"/>
+                  <w:u w:val="single"/>
+                  <w:rtl w:val="0"/>
+                </w:rPr>
+                <w:t xml:space="preserve">Mockup</w:t>
+              </w:r>
+            </w:hyperlink>
             <w:r>
               <w:rPr>
                 <w:rtl w:val="0"/>
@@ -11402,7 +11470,7 @@
                 <w:szCs w:val="18"/>
                 <w:rtl w:val="0"/>
               </w:rPr>
-              <w:t xml:space="preserve">Tablero Kanban</w:t>
+              <w:t xml:space="preserve">Tablero Kanban(Cronograma)</w:t>
             </w:r>
           </w:p>
         </w:tc>
@@ -11476,7 +11544,7 @@
                 <w:szCs w:val="22"/>
               </w:rPr>
             </w:pPr>
-            <w:hyperlink r:id="rId17">
+            <w:hyperlink r:id="rId25">
               <w:r>
                 <w:rPr>
                   <w:rFonts w:ascii="Calibri" w:cs="Calibri" w:eastAsia="Calibri" w:hAnsi="Calibri"/>
@@ -11548,15 +11616,8 @@
             </w:pPr>
             <w:r>
               <w:rPr>
-                <w:rFonts w:ascii="Calibri" w:cs="Calibri" w:eastAsia="Calibri" w:hAnsi="Calibri"/>
-                <w:i w:val="1"/>
-                <w:iCs w:val="1"/>
-                <w:color w:val="5b9bd5"/>
-                <w:sz w:val="18"/>
-                <w:szCs w:val="18"/>
-                <w:rtl w:val="0"/>
-              </w:rPr>
-              <w:t xml:space="preserve">11</w:t>
+                <w:rtl w:val="0"/>
+              </w:rPr>
             </w:r>
           </w:p>
         </w:tc>
@@ -11591,15 +11652,8 @@
             </w:pPr>
             <w:r>
               <w:rPr>
-                <w:rFonts w:ascii="Calibri" w:cs="Calibri" w:eastAsia="Calibri" w:hAnsi="Calibri"/>
-                <w:i w:val="1"/>
-                <w:iCs w:val="1"/>
-                <w:color w:val="5b9bd5"/>
-                <w:sz w:val="18"/>
-                <w:szCs w:val="18"/>
-                <w:rtl w:val="0"/>
-              </w:rPr>
-              <w:t xml:space="preserve">Cronograma</w:t>
+                <w:rtl w:val="0"/>
+              </w:rPr>
             </w:r>
           </w:p>
         </w:tc>
@@ -11634,15 +11688,8 @@
             </w:pPr>
             <w:r>
               <w:rPr>
-                <w:rFonts w:ascii="Calibri" w:cs="Calibri" w:eastAsia="Calibri" w:hAnsi="Calibri"/>
-                <w:i w:val="1"/>
-                <w:iCs w:val="1"/>
-                <w:color w:val="548dd4"/>
-                <w:sz w:val="18"/>
-                <w:szCs w:val="18"/>
-                <w:rtl w:val="0"/>
-              </w:rPr>
-              <w:t xml:space="preserve">Documento de planificación que contiene un aproximado de las fechas en las que se irán desarrollando cada tarea</w:t>
+                <w:rtl w:val="0"/>
+              </w:rPr>
             </w:r>
           </w:p>
         </w:tc>
@@ -17011,121 +17058,6 @@
               <w:spacing w:line="259" w:lineRule="auto"/>
               <w:rPr>
                 <w:rFonts w:ascii="Calibri" w:cs="Calibri" w:eastAsia="Calibri" w:hAnsi="Calibri"/>
-                <w:i w:val="1"/>
-                <w:iCs w:val="1"/>
-                <w:color w:val="548dd4"/>
-                <w:sz w:val="20"/>
-                <w:szCs w:val="20"/>
-              </w:rPr>
-            </w:pPr>
-            <w:r>
-              <w:rPr>
-                <w:rFonts w:ascii="Calibri" w:cs="Calibri" w:eastAsia="Calibri" w:hAnsi="Calibri"/>
-                <w:i w:val="1"/>
-                <w:iCs w:val="1"/>
-                <w:color w:val="548dd4"/>
-                <w:sz w:val="20"/>
-                <w:szCs w:val="20"/>
-                <w:rtl w:val="0"/>
-              </w:rPr>
-              <w:t xml:space="preserve">En la gran mayoría las aplicaciones de macros, solo se encargan de los cálculos y de llevar una pauta sobre la dieta de las personas, por otro lado existen aplicaciones que pueden recomendar comidas en base a productos que uno ingresa y debería tener en su cocina, más no muestran su valor nutritivo ni recomiendan productos en base a lo que necesita el usuario y las apps de rutinas no contienen nada que tenga que ver con la nutrición, solo generación de rutinas en base a  la altura, peso y edad de las personas, si bien recomiendan en base a metas que quiera alcanzar la persona, estas apps solo se enfocan en los ejercicios y no la dieta.</w:t>
-            </w:r>
-          </w:p>
-          <w:p>
-            <w:pPr>
-              <w:spacing w:line="259" w:lineRule="auto"/>
-              <w:rPr>
-                <w:rFonts w:ascii="Calibri" w:cs="Calibri" w:eastAsia="Calibri" w:hAnsi="Calibri"/>
-                <w:i w:val="1"/>
-                <w:iCs w:val="1"/>
-                <w:color w:val="548dd4"/>
-                <w:sz w:val="20"/>
-                <w:szCs w:val="20"/>
-              </w:rPr>
-            </w:pPr>
-            <w:r>
-              <w:rPr>
-                <w:rtl w:val="0"/>
-              </w:rPr>
-            </w:r>
-          </w:p>
-          <w:p>
-            <w:pPr>
-              <w:spacing w:line="259" w:lineRule="auto"/>
-              <w:rPr>
-                <w:rFonts w:ascii="Calibri" w:cs="Calibri" w:eastAsia="Calibri" w:hAnsi="Calibri"/>
-                <w:i w:val="1"/>
-                <w:iCs w:val="1"/>
-                <w:color w:val="548dd4"/>
-                <w:sz w:val="20"/>
-                <w:szCs w:val="20"/>
-              </w:rPr>
-            </w:pPr>
-            <w:r>
-              <w:rPr>
-                <w:rtl w:val="0"/>
-              </w:rPr>
-            </w:r>
-          </w:p>
-          <w:p>
-            <w:pPr>
-              <w:spacing w:line="259" w:lineRule="auto"/>
-              <w:rPr>
-                <w:rFonts w:ascii="Calibri" w:cs="Calibri" w:eastAsia="Calibri" w:hAnsi="Calibri"/>
-                <w:i w:val="1"/>
-                <w:iCs w:val="1"/>
-                <w:color w:val="548dd4"/>
-                <w:sz w:val="20"/>
-                <w:szCs w:val="20"/>
-              </w:rPr>
-            </w:pPr>
-            <w:r>
-              <w:rPr>
-                <w:rtl w:val="0"/>
-              </w:rPr>
-            </w:r>
-          </w:p>
-          <w:p>
-            <w:pPr>
-              <w:spacing w:line="259" w:lineRule="auto"/>
-              <w:rPr>
-                <w:rFonts w:ascii="Calibri" w:cs="Calibri" w:eastAsia="Calibri" w:hAnsi="Calibri"/>
-                <w:i w:val="1"/>
-                <w:iCs w:val="1"/>
-                <w:color w:val="548dd4"/>
-                <w:sz w:val="20"/>
-                <w:szCs w:val="20"/>
-              </w:rPr>
-            </w:pPr>
-            <w:r>
-              <w:rPr>
-                <w:rtl w:val="0"/>
-              </w:rPr>
-            </w:r>
-          </w:p>
-          <w:p>
-            <w:pPr>
-              <w:keepNext w:val="0"/>
-              <w:keepLines w:val="0"/>
-              <w:pageBreakBefore w:val="0"/>
-              <w:widowControl w:val="1"/>
-              <w:pBdr>
-                <w:top w:space="0" w:sz="0" w:val="nil"/>
-                <w:left w:space="0" w:sz="0" w:val="nil"/>
-                <w:bottom w:space="0" w:sz="0" w:val="nil"/>
-                <w:right w:space="0" w:sz="0" w:val="nil"/>
-                <w:between w:space="0" w:sz="0" w:val="nil"/>
-              </w:pBdr>
-              <w:shd w:fill="auto" w:val="clear"/>
-              <w:tabs>
-                <w:tab w:val="center" w:leader="none" w:pos="4419"/>
-                <w:tab w:val="right" w:leader="none" w:pos="8838"/>
-              </w:tabs>
-              <w:spacing w:after="0" w:before="0" w:line="240" w:lineRule="auto"/>
-              <w:ind w:left="0" w:right="0" w:firstLine="0"/>
-              <w:jc w:val="left"/>
-              <w:rPr>
-                <w:rFonts w:ascii="Calibri" w:cs="Calibri" w:eastAsia="Calibri" w:hAnsi="Calibri"/>
                 <w:b w:val="0"/>
                 <w:bCs w:val="0"/>
                 <w:i w:val="0"/>
@@ -17140,6 +17072,18 @@
                 <w:vertAlign w:val="baseline"/>
               </w:rPr>
             </w:pPr>
+            <w:r>
+              <w:rPr>
+                <w:rFonts w:ascii="Calibri" w:cs="Calibri" w:eastAsia="Calibri" w:hAnsi="Calibri"/>
+                <w:i w:val="1"/>
+                <w:iCs w:val="1"/>
+                <w:color w:val="548dd4"/>
+                <w:sz w:val="20"/>
+                <w:szCs w:val="20"/>
+                <w:rtl w:val="0"/>
+              </w:rPr>
+              <w:t xml:space="preserve">En la gran mayoría las aplicaciones de macros, solo se encargan de los cálculos y de llevar una pauta sobre la dieta de las personas, por otro lado existen aplicaciones que pueden recomendar comidas en base a productos que uno ingresa y debería tener en su cocina, más no muestran su valor nutritivo ni recomiendan productos en base a lo que necesita el usuario y las apps de rutinas no contienen nada que tenga que ver con la nutrición, solo generación de rutinas en base a  la altura, peso y edad de las personas, si bien recomiendan en base a metas que quiera alcanzar la persona, estas apps solo se enfocan en los ejercicios y no la dieta.</w:t>
+            </w:r>
             <w:r>
               <w:rPr>
                 <w:rtl w:val="0"/>
@@ -17164,14 +17108,80 @@
       </w:r>
     </w:p>
     <w:sectPr>
-      <w:headerReference r:id="rId18" w:type="default"/>
-      <w:footerReference r:id="rId19" w:type="default"/>
+      <w:headerReference r:id="rId26" w:type="default"/>
+      <w:footerReference r:id="rId27" w:type="default"/>
       <w:pgSz w:h="18720" w:w="12240" w:orient="portrait"/>
       <w:pgMar w:bottom="1417" w:top="1417" w:left="1701" w:right="1701" w:header="708" w:footer="1202"/>
       <w:pgNumType w:start="1"/>
     </w:sectPr>
   </w:body>
 </w:document>
+</file>
+
+<file path=word/comments.xml><?xml version="1.0" encoding="utf-8"?>
+<w:comments xmlns:mc="http://schemas.openxmlformats.org/markup-compatibility/2006" xmlns:o="urn:schemas-microsoft-com:office:office" xmlns:r="http://schemas.openxmlformats.org/officeDocument/2006/relationships" xmlns:m="http://schemas.openxmlformats.org/officeDocument/2006/math" xmlns:v="urn:schemas-microsoft-com:vml" xmlns:wp="http://schemas.openxmlformats.org/drawingml/2006/wordprocessingDrawing" xmlns:w10="urn:schemas-microsoft-com:office:word" xmlns:w="http://schemas.openxmlformats.org/wordprocessingml/2006/main" xmlns:wne="http://schemas.microsoft.com/office/word/2006/wordml" xmlns:sl="http://schemas.openxmlformats.org/schemaLibrary/2006/main" xmlns:a="http://schemas.openxmlformats.org/drawingml/2006/main" xmlns:pic="http://schemas.openxmlformats.org/drawingml/2006/picture" xmlns:c="http://schemas.openxmlformats.org/drawingml/2006/chart" xmlns:lc="http://schemas.openxmlformats.org/drawingml/2006/lockedCanvas" xmlns:dgm="http://schemas.openxmlformats.org/drawingml/2006/diagram" xmlns:wps="http://schemas.microsoft.com/office/word/2010/wordprocessingShape" xmlns:wpg="http://schemas.microsoft.com/office/word/2010/wordprocessingGroup" xmlns:w14="http://schemas.microsoft.com/office/word/2010/wordml" xmlns:w15="http://schemas.microsoft.com/office/word/2012/wordml" xmlns:w16="http://schemas.microsoft.com/office/word/2018/wordml" xmlns:w16cex="http://schemas.microsoft.com/office/word/2018/wordml/cex" xmlns:w16cid="http://schemas.microsoft.com/office/word/2016/wordml/cid" xmlns="http://schemas.microsoft.com/office/tasks/2019/documenttasks" xmlns:cr="http://schemas.microsoft.com/office/comments/2020/reactions">
+  <w:comment w:author="Cristian Javier Orellana Apablaza" w:id="0" w:date="2026-05-18T19:39:37Z">
+    <w:p>
+      <w:pPr>
+        <w:keepNext w:val="0"/>
+        <w:keepLines w:val="0"/>
+        <w:pageBreakBefore w:val="0"/>
+        <w:widowControl w:val="0"/>
+        <w:pBdr>
+          <w:top w:space="0" w:sz="0" w:val="nil"/>
+          <w:left w:space="0" w:sz="0" w:val="nil"/>
+          <w:bottom w:space="0" w:sz="0" w:val="nil"/>
+          <w:right w:space="0" w:sz="0" w:val="nil"/>
+          <w:between w:space="0" w:sz="0" w:val="nil"/>
+        </w:pBdr>
+        <w:shd w:fill="auto" w:val="clear"/>
+        <w:spacing w:after="0" w:before="0" w:line="240" w:lineRule="auto"/>
+        <w:ind w:left="0" w:right="0" w:firstLine="0"/>
+        <w:jc w:val="left"/>
+        <w:rPr>
+          <w:rFonts w:ascii="Arial" w:cs="Arial" w:eastAsia="Arial" w:hAnsi="Arial"/>
+          <w:b w:val="0"/>
+          <w:bCs w:val="0"/>
+          <w:i w:val="0"/>
+          <w:iCs w:val="0"/>
+          <w:smallCaps w:val="0"/>
+          <w:strike w:val="0"/>
+          <w:color w:val="000000"/>
+          <w:sz w:val="22"/>
+          <w:szCs w:val="22"/>
+          <w:u w:val="none"/>
+          <w:shd w:fill="auto" w:val="clear"/>
+          <w:vertAlign w:val="baseline"/>
+        </w:rPr>
+      </w:pPr>
+      <w:r>
+        <w:rPr>
+          <w:rFonts w:ascii="Arial" w:cs="Arial" w:eastAsia="Arial" w:hAnsi="Arial"/>
+          <w:b w:val="0"/>
+          <w:bCs w:val="0"/>
+          <w:i w:val="0"/>
+          <w:iCs w:val="0"/>
+          <w:smallCaps w:val="0"/>
+          <w:strike w:val="0"/>
+          <w:color w:val="000000"/>
+          <w:sz w:val="22"/>
+          <w:szCs w:val="22"/>
+          <w:u w:val="none"/>
+          <w:shd w:fill="auto" w:val="clear"/>
+          <w:vertAlign w:val="baseline"/>
+          <w:rtl w:val="0"/>
+        </w:rPr>
+        <w:t xml:space="preserve">ESCRIBAN LAS APIS QUE  USARON EN  SUS MICROS</w:t>
+      </w:r>
+    </w:p>
+  </w:comment>
+</w:comments>
+</file>
+
+<file path=word/commentsExtended.xml><?xml version="1.0" encoding="utf-8"?>
+<w15:commentsEx xmlns:mc="http://schemas.openxmlformats.org/markup-compatibility/2006" xmlns:o="urn:schemas-microsoft-com:office:office" xmlns:r="http://schemas.openxmlformats.org/officeDocument/2006/relationships" xmlns:m="http://schemas.openxmlformats.org/officeDocument/2006/math" xmlns:v="urn:schemas-microsoft-com:vml" xmlns:wp="http://schemas.openxmlformats.org/drawingml/2006/wordprocessingDrawing" xmlns:w10="urn:schemas-microsoft-com:office:word" xmlns:w="http://schemas.openxmlformats.org/wordprocessingml/2006/main" xmlns:wne="http://schemas.microsoft.com/office/word/2006/wordml" xmlns:sl="http://schemas.openxmlformats.org/schemaLibrary/2006/main" xmlns:a="http://schemas.openxmlformats.org/drawingml/2006/main" xmlns:pic="http://schemas.openxmlformats.org/drawingml/2006/picture" xmlns:c="http://schemas.openxmlformats.org/drawingml/2006/chart" xmlns:lc="http://schemas.openxmlformats.org/drawingml/2006/lockedCanvas" xmlns:dgm="http://schemas.openxmlformats.org/drawingml/2006/diagram" xmlns:wps="http://schemas.microsoft.com/office/word/2010/wordprocessingShape" xmlns:wpg="http://schemas.microsoft.com/office/word/2010/wordprocessingGroup" xmlns:w14="http://schemas.microsoft.com/office/word/2010/wordml" xmlns:w15="http://schemas.microsoft.com/office/word/2012/wordml" xmlns:w16="http://schemas.microsoft.com/office/word/2018/wordml" xmlns:w16cex="http://schemas.microsoft.com/office/word/2018/wordml/cex" xmlns:w16cid="http://schemas.microsoft.com/office/word/2016/wordml/cid" xmlns="http://schemas.microsoft.com/office/tasks/2019/documenttasks" xmlns:cr="http://schemas.microsoft.com/office/comments/2020/reactions">
+  <w15:commentEx w15:paraId="000001DE" w15:done="0"/>
+</w15:commentsEx>
 </file>
 
 <file path=word/footer1.xml><?xml version="1.0" encoding="utf-8"?>
@@ -17456,12 +17466,12 @@
         <wp:inline distB="0" distT="0" distL="0" distR="0">
           <wp:extent cx="1869144" cy="498662"/>
           <wp:effectExtent b="0" l="0" r="0" t="0"/>
-          <wp:docPr descr="Texto&#10;&#10;Descripción generada automáticamente con confianza media" id="2106009982" name="image3.jpg"/>
+          <wp:docPr descr="Texto&#10;&#10;Descripción generada automáticamente con confianza media" id="2106009982" name="image4.jpg"/>
           <a:graphic>
             <a:graphicData uri="http://schemas.openxmlformats.org/drawingml/2006/picture">
               <pic:pic>
                 <pic:nvPicPr>
-                  <pic:cNvPr descr="Texto&#10;&#10;Descripción generada automáticamente con confianza media" id="0" name="image3.jpg"/>
+                  <pic:cNvPr descr="Texto&#10;&#10;Descripción generada automáticamente con confianza media" id="0" name="image4.jpg"/>
                   <pic:cNvPicPr preferRelativeResize="0"/>
                 </pic:nvPicPr>
                 <pic:blipFill>
@@ -19045,7 +19055,7 @@
 
 <file path=customXML/item1.xml><?xml version="1.0" encoding="utf-8"?>
 <go:gDocsCustomXmlDataStorage xmlns:go="http://customooxmlschemas.google.com/" xmlns:r="http://schemas.openxmlformats.org/officeDocument/2006/relationships" uri="GoogleDocsCustomDataVersion2">
-  <go:docsCustomData xmlns:go="http://customooxmlschemas.google.com/" roundtripDataSignature="AMtx7mhhvx5SQCClHORZZXrFi9JyDqbSQQ==">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</go:docsCustomData>
+  <go:docsCustomData xmlns:go="http://customooxmlschemas.google.com/" roundtripDataSignature="AMtx7mgg7WnE8gD1n3MIqY0ddt6BorKIFA==">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</go:docsCustomData>
 </go:gDocsCustomXmlDataStorage>
 </file>
 

</xml_diff>